<commit_message>
unifico ambos slides de info
</commit_message>
<xml_diff>
--- a/public/templates/inquilino-recibi-base.docx
+++ b/public/templates/inquilino-recibi-base.docx
@@ -729,17 +729,15 @@
           <w:rFonts w:ascii="Arial" w:hAnsi="Arial" w:cs="Arial"/>
           <w:sz w:val="28"/>
         </w:rPr>
-        <w:t xml:space="preserve">, de la ciudad de Mar del </w:t>
-      </w:r>
-      <w:proofErr w:type="gramStart"/>
-      <w:r>
-        <w:rPr>
-          <w:rFonts w:ascii="Arial" w:hAnsi="Arial" w:cs="Arial"/>
-          <w:sz w:val="28"/>
-        </w:rPr>
-        <w:t>Plata.----------------------------------------------------------------------------------</w:t>
-      </w:r>
-      <w:proofErr w:type="gramEnd"/>
+        <w:t>, de la ciudad de Mar del Plata.-------------------------------------------</w:t>
+      </w:r>
+      <w:r>
+        <w:rPr>
+          <w:rFonts w:ascii="Arial" w:hAnsi="Arial" w:cs="Arial"/>
+          <w:sz w:val="28"/>
+        </w:rPr>
+        <w:t xml:space="preserve"> </w:t>
+      </w:r>
       <w:r>
         <w:rPr>
           <w:rFonts w:ascii="Arial" w:hAnsi="Arial" w:cs="Arial"/>
@@ -794,7 +792,7 @@
       </w:r>
     </w:p>
     <w:sectPr>
-      <w:pgSz w:w="12240" w:h="15840"/>
+      <w:pgSz w:w="12240" w:h="20160" w:code="5"/>
       <w:pgMar w:top="1417" w:right="1701" w:bottom="1417" w:left="1701" w:header="708" w:footer="708" w:gutter="0"/>
       <w:cols w:space="708"/>
       <w:docGrid w:linePitch="360"/>

</xml_diff>